<commit_message>
correção de detalhe no artigo
</commit_message>
<xml_diff>
--- a/Atividade_avaliativa1_artigo_de_fundamentacao_e_desenvolvimento_academico.docx
+++ b/Atividade_avaliativa1_artigo_de_fundamentacao_e_desenvolvimento_academico.docx
@@ -1482,6 +1482,49 @@
           <w:szCs w:val="20"/>
         </w:rPr>
         <w:t>Fonte: Produção própria</w:t>
+      </w:r>
+    </w:p>
+    <w:p>
+      <w:pPr>
+        <w:pStyle w:val="Normal"/>
+        <w:spacing w:before="0" w:after="120"/>
+        <w:jc w:val="both"/>
+        <w:rPr>
+          <w:rFonts w:ascii="Arial" w:hAnsi="Arial" w:cs="Arial"/>
+        </w:rPr>
+      </w:pPr>
+      <w:r>
+        <w:rPr>
+          <w:rFonts w:cs="Arial" w:ascii="Arial" w:hAnsi="Arial"/>
+        </w:rPr>
+      </w:r>
+    </w:p>
+    <w:p>
+      <w:pPr>
+        <w:pStyle w:val="Normal"/>
+        <w:spacing w:before="0" w:after="120"/>
+        <w:jc w:val="both"/>
+        <w:rPr>
+          <w:rFonts w:ascii="Arial" w:hAnsi="Arial" w:cs="Arial"/>
+        </w:rPr>
+      </w:pPr>
+      <w:r>
+        <w:rPr>
+          <w:rFonts w:cs="Arial" w:ascii="Arial" w:hAnsi="Arial"/>
+        </w:rPr>
+        <w:t xml:space="preserve">Na Query 3, o tempo de execução sofreu um aumento de 0,413s para 0,732s. Esse comportamento é causado pelas características do ambiente: a tabela de movimentações possui um volume moderado (500 mil registos) e o hardware de teste utiliza um SSD NVMe de altíssima velocidade. O motor do SQLite executou a leitura sequencial pura de forma quase instantânea. Ao forçar o uso do índice para o intervalo de datas, o custo </w:t>
+      </w:r>
+      <w:r>
+        <w:rPr>
+          <w:rFonts w:cs="Arial" w:ascii="Arial" w:hAnsi="Arial"/>
+        </w:rPr>
+        <w:t>de hardware</w:t>
+      </w:r>
+      <w:r>
+        <w:rPr>
+          <w:rFonts w:cs="Arial" w:ascii="Arial" w:hAnsi="Arial"/>
+        </w:rPr>
+        <w:t xml:space="preserve"> na estrutura de árvore B-Tree para recuperar os dados causou overhead, assim, deixando a consulta mais lenta.</w:t>
       </w:r>
     </w:p>
     <w:p>

</xml_diff>